<commit_message>
Compile Effort_Log and draft appendix section; add AI use diclosure.
</commit_message>
<xml_diff>
--- a/report/08_Appendices.docx
+++ b/report/08_Appendices.docx
@@ -1030,7 +1030,333 @@
         <w:t>.</w:t>
       </w:r>
     </w:p>
+    <w:p>
+      <w:pPr>
+        <w:sectPr>
+          <w:pgSz w:w="12240" w:h="15840"/>
+          <w:pgMar w:top="1440" w:right="1440" w:bottom="1440" w:left="1440" w:header="720" w:footer="720" w:gutter="0"/>
+          <w:cols w:space="720"/>
+          <w:docGrid w:linePitch="360"/>
+        </w:sectPr>
+      </w:pPr>
+    </w:p>
+    <w:p>
+      <w:pPr>
+        <w:pStyle w:val="Heading1"/>
+      </w:pPr>
+      <w:r>
+        <w:lastRenderedPageBreak/>
+        <w:t>Appendix E: Team Effort Log</w:t>
+      </w:r>
+    </w:p>
     <w:p/>
+    <w:p>
+      <w:r>
+        <w:t>Table E.1 summarizes reported project hours by team member. The following individual logs provide the detailed activity records.</w:t>
+      </w:r>
+    </w:p>
+    <w:p>
+      <w:r>
+        <w:t>[INSERT SCREENSHOT: Summary]</w:t>
+      </w:r>
+    </w:p>
+    <w:p/>
+    <w:p>
+      <w:pPr>
+        <w:pStyle w:val="Heading2"/>
+      </w:pPr>
+      <w:r>
+        <w:t>Andy Adelman Individual Effort Log</w:t>
+      </w:r>
+    </w:p>
+    <w:p/>
+    <w:p>
+      <w:r>
+        <w:t xml:space="preserve">Table E.2. </w:t>
+      </w:r>
+      <w:proofErr w:type="gramStart"/>
+      <w:r>
+        <w:t>Andy Adelman individual effort log.</w:t>
+      </w:r>
+      <w:proofErr w:type="gramEnd"/>
+    </w:p>
+    <w:p>
+      <w:r>
+        <w:t>[INSERT SCREENSHOT: Andy Adelman effort-log table]</w:t>
+      </w:r>
+    </w:p>
+    <w:p/>
+    <w:p>
+      <w:pPr>
+        <w:pStyle w:val="Heading2"/>
+      </w:pPr>
+      <w:r>
+        <w:t>Eduardo Rodriguez Individual Effort Log</w:t>
+      </w:r>
+    </w:p>
+    <w:p/>
+    <w:p>
+      <w:r>
+        <w:t xml:space="preserve">Table E.3. </w:t>
+      </w:r>
+      <w:proofErr w:type="gramStart"/>
+      <w:r>
+        <w:t>Eduardo Rodriguez individual effort log.</w:t>
+      </w:r>
+      <w:proofErr w:type="gramEnd"/>
+    </w:p>
+    <w:p>
+      <w:r>
+        <w:t>[INSERT SCREENSHOT: Eduardo Rodriguez effort-log table]</w:t>
+      </w:r>
+    </w:p>
+    <w:p/>
+    <w:p>
+      <w:pPr>
+        <w:pStyle w:val="Heading2"/>
+      </w:pPr>
+      <w:proofErr w:type="spellStart"/>
+      <w:r>
+        <w:t>Krithika</w:t>
+      </w:r>
+      <w:proofErr w:type="spellEnd"/>
+      <w:r>
+        <w:t xml:space="preserve"> Rees Individual Effort Log</w:t>
+      </w:r>
+    </w:p>
+    <w:p/>
+    <w:p>
+      <w:r>
+        <w:t xml:space="preserve">Table E.4. </w:t>
+      </w:r>
+      <w:proofErr w:type="spellStart"/>
+      <w:proofErr w:type="gramStart"/>
+      <w:r>
+        <w:t>Krithika</w:t>
+      </w:r>
+      <w:proofErr w:type="spellEnd"/>
+      <w:r>
+        <w:t xml:space="preserve"> Rees individual effort log.</w:t>
+      </w:r>
+      <w:proofErr w:type="gramEnd"/>
+    </w:p>
+    <w:p>
+      <w:r>
+        <w:t xml:space="preserve">[INSERT SCREENSHOT: </w:t>
+      </w:r>
+      <w:proofErr w:type="spellStart"/>
+      <w:r>
+        <w:t>Krithika</w:t>
+      </w:r>
+      <w:proofErr w:type="spellEnd"/>
+      <w:r>
+        <w:t xml:space="preserve"> Rees effort-log table]</w:t>
+      </w:r>
+    </w:p>
+    <w:p/>
+    <w:p>
+      <w:pPr>
+        <w:pStyle w:val="Heading2"/>
+      </w:pPr>
+      <w:proofErr w:type="spellStart"/>
+      <w:r>
+        <w:t>Rasheedat</w:t>
+      </w:r>
+      <w:proofErr w:type="spellEnd"/>
+      <w:r>
+        <w:t xml:space="preserve"> </w:t>
+      </w:r>
+      <w:proofErr w:type="spellStart"/>
+      <w:r>
+        <w:t>Emiola</w:t>
+      </w:r>
+      <w:proofErr w:type="spellEnd"/>
+      <w:r>
+        <w:t xml:space="preserve"> Individual Effort Log</w:t>
+      </w:r>
+    </w:p>
+    <w:p/>
+    <w:p>
+      <w:r>
+        <w:t xml:space="preserve">Table E.5. </w:t>
+      </w:r>
+      <w:proofErr w:type="spellStart"/>
+      <w:proofErr w:type="gramStart"/>
+      <w:r>
+        <w:t>Rasheedat</w:t>
+      </w:r>
+      <w:proofErr w:type="spellEnd"/>
+      <w:r>
+        <w:t xml:space="preserve"> </w:t>
+      </w:r>
+      <w:proofErr w:type="spellStart"/>
+      <w:r>
+        <w:t>Emiola</w:t>
+      </w:r>
+      <w:proofErr w:type="spellEnd"/>
+      <w:r>
+        <w:t xml:space="preserve"> individual effort log.</w:t>
+      </w:r>
+      <w:proofErr w:type="gramEnd"/>
+    </w:p>
+    <w:p>
+      <w:r>
+        <w:t xml:space="preserve">[INSERT SCREENSHOT: </w:t>
+      </w:r>
+      <w:proofErr w:type="spellStart"/>
+      <w:r>
+        <w:t>Rasheedat</w:t>
+      </w:r>
+      <w:proofErr w:type="spellEnd"/>
+      <w:r>
+        <w:t xml:space="preserve"> </w:t>
+      </w:r>
+      <w:proofErr w:type="spellStart"/>
+      <w:r>
+        <w:t>Emiola</w:t>
+      </w:r>
+      <w:proofErr w:type="spellEnd"/>
+      <w:r>
+        <w:t xml:space="preserve"> effort-log table]</w:t>
+      </w:r>
+    </w:p>
+    <w:p/>
+    <w:p>
+      <w:pPr>
+        <w:pStyle w:val="Heading2"/>
+      </w:pPr>
+      <w:r>
+        <w:lastRenderedPageBreak/>
+        <w:t>Daniel Steffen</w:t>
+      </w:r>
+      <w:r>
+        <w:t xml:space="preserve"> </w:t>
+      </w:r>
+      <w:r>
+        <w:t>Individual Effort Log</w:t>
+      </w:r>
+    </w:p>
+    <w:p>
+      <w:r>
+        <w:t>At the time of this writing, Daniel Steffen has not submitted any hours.</w:t>
+      </w:r>
+    </w:p>
+    <w:p>
+      <w:pPr>
+        <w:sectPr>
+          <w:pgSz w:w="12240" w:h="15840"/>
+          <w:pgMar w:top="1440" w:right="1440" w:bottom="1440" w:left="1440" w:header="720" w:footer="720" w:gutter="0"/>
+          <w:cols w:space="720"/>
+          <w:docGrid w:linePitch="360"/>
+        </w:sectPr>
+      </w:pPr>
+    </w:p>
+    <w:p>
+      <w:pPr>
+        <w:pStyle w:val="Heading1"/>
+      </w:pPr>
+      <w:r>
+        <w:lastRenderedPageBreak/>
+        <w:t>Appendix F: Academic Integrity and AI Usage</w:t>
+      </w:r>
+    </w:p>
+    <w:p/>
+    <w:p>
+      <w:r>
+        <w:t>Artificial intelligence tools were used throughout this project much as a database-development team might consult technical documentation, reference examples, or an experienced colleague. AI was used to explore alternatives, clarify implementation questions, and review completed work. It did not replace the team’s responsibility to understand, validate, and approve the work submitted.</w:t>
+      </w:r>
+    </w:p>
+    <w:p>
+      <w:r>
+        <w:t xml:space="preserve">The team used </w:t>
+      </w:r>
+      <w:proofErr w:type="spellStart"/>
+      <w:r>
+        <w:t>ChatGPT</w:t>
+      </w:r>
+      <w:proofErr w:type="spellEnd"/>
+      <w:r>
+        <w:t xml:space="preserve"> and Claude to:</w:t>
+      </w:r>
+    </w:p>
+    <w:p>
+      <w:pPr>
+        <w:pStyle w:val="ListParagraph"/>
+        <w:numPr>
+          <w:ilvl w:val="0"/>
+          <w:numId w:val="5"/>
+        </w:numPr>
+      </w:pPr>
+      <w:r>
+        <w:t>Explore and validate database design, SQL, synthetic-data, and query approaches.</w:t>
+      </w:r>
+    </w:p>
+    <w:p>
+      <w:pPr>
+        <w:pStyle w:val="ListParagraph"/>
+        <w:numPr>
+          <w:ilvl w:val="0"/>
+          <w:numId w:val="5"/>
+        </w:numPr>
+      </w:pPr>
+      <w:r>
+        <w:t>Assist with technical troubleshooting and interpretation of test and query results.</w:t>
+      </w:r>
+    </w:p>
+    <w:p>
+      <w:pPr>
+        <w:pStyle w:val="ListParagraph"/>
+        <w:numPr>
+          <w:ilvl w:val="0"/>
+          <w:numId w:val="5"/>
+        </w:numPr>
+      </w:pPr>
+      <w:r>
+        <w:t>Review completed project materials for consistency, requirement coverage, and final editing.</w:t>
+      </w:r>
+    </w:p>
+    <w:p>
+      <w:r>
+        <w:t xml:space="preserve">All significant business decisions, database-model changes, SQL revisions, </w:t>
+      </w:r>
+      <w:proofErr w:type="spellStart"/>
+      <w:r>
+        <w:t>Lucidchart</w:t>
+      </w:r>
+      <w:proofErr w:type="spellEnd"/>
+      <w:r>
+        <w:t xml:space="preserve"> diagrams, query results, and final report content were reviewed and approved by team members. AI-as</w:t>
+      </w:r>
+      <w:r>
+        <w:t>sisted material was treated as</w:t>
+      </w:r>
+      <w:r>
+        <w:t xml:space="preserve"> </w:t>
+      </w:r>
+      <w:r>
+        <w:t>unverified source</w:t>
+      </w:r>
+      <w:r>
+        <w:t xml:space="preserve"> </w:t>
+      </w:r>
+      <w:r>
+        <w:t>material</w:t>
+      </w:r>
+      <w:r>
+        <w:t xml:space="preserve"> </w:t>
+      </w:r>
+      <w:r>
+        <w:t xml:space="preserve">that was revised and tested </w:t>
+      </w:r>
+      <w:r>
+        <w:t>by the team before submission.</w:t>
+      </w:r>
+    </w:p>
+    <w:p>
+      <w:r>
+        <w:t>AI was used to support learning, analysis, and database development rather than replace the team’s understanding or ownership of the project. The submitted work reflects the team’s final decisions and its understanding of the Domino’s online-ordering database design.</w:t>
+      </w:r>
+    </w:p>
     <w:sectPr>
       <w:pgSz w:w="12240" w:h="15840"/>
       <w:pgMar w:top="1440" w:right="1440" w:bottom="1440" w:left="1440" w:header="720" w:footer="720" w:gutter="0"/>
@@ -1381,6 +1707,119 @@
     </w:lvl>
   </w:abstractNum>
   <w:abstractNum w:abstractNumId="3">
+    <w:nsid w:val="53924892"/>
+    <w:multiLevelType w:val="hybridMultilevel"/>
+    <w:tmpl w:val="9E024942"/>
+    <w:lvl w:ilvl="0" w:tplc="04090001">
+      <w:start w:val="1"/>
+      <w:numFmt w:val="bullet"/>
+      <w:lvlText w:val=""/>
+      <w:lvlJc w:val="left"/>
+      <w:pPr>
+        <w:ind w:left="720" w:hanging="360"/>
+      </w:pPr>
+      <w:rPr>
+        <w:rFonts w:ascii="Symbol" w:hAnsi="Symbol" w:hint="default"/>
+      </w:rPr>
+    </w:lvl>
+    <w:lvl w:ilvl="1" w:tplc="04090003" w:tentative="1">
+      <w:start w:val="1"/>
+      <w:numFmt w:val="bullet"/>
+      <w:lvlText w:val="o"/>
+      <w:lvlJc w:val="left"/>
+      <w:pPr>
+        <w:ind w:left="1440" w:hanging="360"/>
+      </w:pPr>
+      <w:rPr>
+        <w:rFonts w:ascii="Courier New" w:hAnsi="Courier New" w:cs="Courier New" w:hint="default"/>
+      </w:rPr>
+    </w:lvl>
+    <w:lvl w:ilvl="2" w:tplc="04090005" w:tentative="1">
+      <w:start w:val="1"/>
+      <w:numFmt w:val="bullet"/>
+      <w:lvlText w:val=""/>
+      <w:lvlJc w:val="left"/>
+      <w:pPr>
+        <w:ind w:left="2160" w:hanging="360"/>
+      </w:pPr>
+      <w:rPr>
+        <w:rFonts w:ascii="Wingdings" w:hAnsi="Wingdings" w:hint="default"/>
+      </w:rPr>
+    </w:lvl>
+    <w:lvl w:ilvl="3" w:tplc="04090001" w:tentative="1">
+      <w:start w:val="1"/>
+      <w:numFmt w:val="bullet"/>
+      <w:lvlText w:val=""/>
+      <w:lvlJc w:val="left"/>
+      <w:pPr>
+        <w:ind w:left="2880" w:hanging="360"/>
+      </w:pPr>
+      <w:rPr>
+        <w:rFonts w:ascii="Symbol" w:hAnsi="Symbol" w:hint="default"/>
+      </w:rPr>
+    </w:lvl>
+    <w:lvl w:ilvl="4" w:tplc="04090003" w:tentative="1">
+      <w:start w:val="1"/>
+      <w:numFmt w:val="bullet"/>
+      <w:lvlText w:val="o"/>
+      <w:lvlJc w:val="left"/>
+      <w:pPr>
+        <w:ind w:left="3600" w:hanging="360"/>
+      </w:pPr>
+      <w:rPr>
+        <w:rFonts w:ascii="Courier New" w:hAnsi="Courier New" w:cs="Courier New" w:hint="default"/>
+      </w:rPr>
+    </w:lvl>
+    <w:lvl w:ilvl="5" w:tplc="04090005" w:tentative="1">
+      <w:start w:val="1"/>
+      <w:numFmt w:val="bullet"/>
+      <w:lvlText w:val=""/>
+      <w:lvlJc w:val="left"/>
+      <w:pPr>
+        <w:ind w:left="4320" w:hanging="360"/>
+      </w:pPr>
+      <w:rPr>
+        <w:rFonts w:ascii="Wingdings" w:hAnsi="Wingdings" w:hint="default"/>
+      </w:rPr>
+    </w:lvl>
+    <w:lvl w:ilvl="6" w:tplc="04090001" w:tentative="1">
+      <w:start w:val="1"/>
+      <w:numFmt w:val="bullet"/>
+      <w:lvlText w:val=""/>
+      <w:lvlJc w:val="left"/>
+      <w:pPr>
+        <w:ind w:left="5040" w:hanging="360"/>
+      </w:pPr>
+      <w:rPr>
+        <w:rFonts w:ascii="Symbol" w:hAnsi="Symbol" w:hint="default"/>
+      </w:rPr>
+    </w:lvl>
+    <w:lvl w:ilvl="7" w:tplc="04090003" w:tentative="1">
+      <w:start w:val="1"/>
+      <w:numFmt w:val="bullet"/>
+      <w:lvlText w:val="o"/>
+      <w:lvlJc w:val="left"/>
+      <w:pPr>
+        <w:ind w:left="5760" w:hanging="360"/>
+      </w:pPr>
+      <w:rPr>
+        <w:rFonts w:ascii="Courier New" w:hAnsi="Courier New" w:cs="Courier New" w:hint="default"/>
+      </w:rPr>
+    </w:lvl>
+    <w:lvl w:ilvl="8" w:tplc="04090005" w:tentative="1">
+      <w:start w:val="1"/>
+      <w:numFmt w:val="bullet"/>
+      <w:lvlText w:val=""/>
+      <w:lvlJc w:val="left"/>
+      <w:pPr>
+        <w:ind w:left="6480" w:hanging="360"/>
+      </w:pPr>
+      <w:rPr>
+        <w:rFonts w:ascii="Wingdings" w:hAnsi="Wingdings" w:hint="default"/>
+      </w:rPr>
+    </w:lvl>
+  </w:abstractNum>
+  <w:abstractNum w:abstractNumId="4">
     <w:nsid w:val="70D2712A"/>
     <w:multiLevelType w:val="hybridMultilevel"/>
     <w:tmpl w:val="366C49AA"/>
@@ -1494,7 +1933,7 @@
     </w:lvl>
   </w:abstractNum>
   <w:num w:numId="1">
-    <w:abstractNumId w:val="3"/>
+    <w:abstractNumId w:val="4"/>
   </w:num>
   <w:num w:numId="2">
     <w:abstractNumId w:val="2"/>
@@ -1504,6 +1943,9 @@
   </w:num>
   <w:num w:numId="4">
     <w:abstractNumId w:val="1"/>
+  </w:num>
+  <w:num w:numId="5">
+    <w:abstractNumId w:val="3"/>
   </w:num>
 </w:numbering>
 </file>

</xml_diff>